<commit_message>
added draft data for FRE assignement #2
</commit_message>
<xml_diff>
--- a/Frontend/Abgabe 2/Abgabe 2_Aufteilung Präsentation.docx
+++ b/Frontend/Abgabe 2/Abgabe 2_Aufteilung Präsentation.docx
@@ -20,12 +20,17 @@
         <w:spacing w:after="0"/>
       </w:pPr>
       <w:r>
-        <w:t>Abgabe 2 - Frontend: Authentifizierung</w:t>
+        <w:t xml:space="preserve">Abgabe 2 - Frontend: </w:t>
+      </w:r>
+      <w:bookmarkStart w:id="0" w:name="_Hlk214517386"/>
+      <w:r>
+        <w:t>Authentifizierung</w:t>
       </w:r>
       <w:r>
         <w:t xml:space="preserve"> </w:t>
       </w:r>
     </w:p>
+    <w:bookmarkEnd w:id="0"/>
     <w:p>
       <w:pPr>
         <w:pStyle w:val="Listenabsatz"/>
@@ -144,8 +149,13 @@
         <w:spacing w:after="0"/>
       </w:pPr>
       <w:r>
-        <w:t>Abgabe 2 - Frontend: Autorisierung</w:t>
-      </w:r>
+        <w:t>Abgabe 2 - Frontend</w:t>
+      </w:r>
+      <w:bookmarkStart w:id="1" w:name="_Hlk214517453"/>
+      <w:r>
+        <w:t>: Autorisierung</w:t>
+      </w:r>
+      <w:bookmarkEnd w:id="1"/>
     </w:p>
     <w:p>
       <w:pPr>
@@ -211,10 +221,7 @@
         <w:spacing w:after="0"/>
       </w:pPr>
       <w:r>
-        <w:t>Abgabe 2 - Frontend: Navigation</w:t>
-      </w:r>
-      <w:r>
-        <w:t xml:space="preserve"> (Entweder nur </w:t>
+        <w:t xml:space="preserve">Abgabe 2 - Frontend: Navigation (Entweder nur </w:t>
       </w:r>
       <w:proofErr w:type="spellStart"/>
       <w:r>
@@ -297,12 +304,17 @@
         <w:spacing w:after="0"/>
       </w:pPr>
       <w:r>
-        <w:t xml:space="preserve">Formulare: Registrierung, Produkte, </w:t>
+        <w:t xml:space="preserve">Formulare: </w:t>
+      </w:r>
+      <w:bookmarkStart w:id="2" w:name="_Hlk214519502"/>
+      <w:r>
+        <w:t xml:space="preserve">Registrierung, Produkte, </w:t>
       </w:r>
       <w:proofErr w:type="spellStart"/>
       <w:r>
         <w:t>Checkout</w:t>
       </w:r>
+      <w:bookmarkEnd w:id="2"/>
       <w:proofErr w:type="spellEnd"/>
     </w:p>
     <w:p>
@@ -358,10 +370,7 @@
       </w:r>
       <w:proofErr w:type="spellEnd"/>
       <w:r>
-        <w:t xml:space="preserve"> -&gt;Prüfen jede</w:t>
-      </w:r>
-      <w:r>
-        <w:t>s Feldes Einzeln</w:t>
+        <w:t xml:space="preserve"> -&gt;Prüfen jedes Feldes Einzeln</w:t>
       </w:r>
     </w:p>
     <w:p>

</xml_diff>